<commit_message>
Carry the corrected oref ratio into Papers 4 and 7
The 0.41 is replaced by 0.60 wherever it stood as the oref cohort's ratio, with the
reason stated: the two anchors were fitted on different subsets and both were
regression fits rather than medians. Matched person by person the constants are
207 and 333 rather than 145 and 355, giving 1432 measured against 2219 entered.

Paper 7 keeps the reported value alongside the corrected one so the difference is
visible, and closes on the general point rather than on either number: moving
between two defensible aggregations of identical records shifted the ratio by half
as much as moving between two different datasets did.
</commit_message>
<xml_diff>
--- a/docs/Dynamic-ISF-4-Data-Derived-Findings-2026-06-07.docx
+++ b/docs/Dynamic-ISF-4-Data-Derived-Findings-2026-06-07.docx
@@ -1055,6 +1055,44 @@
       </w:r>
       <w:r>
         <w:t xml:space="preserve">to 0.66 on the same records.</w:t>
+      </w:r>
+    </w:p>
+    <w:p>
+      <w:pPr>
+        <w:pStyle w:val="BodyText"/>
+      </w:pPr>
+      <w:r>
+        <w:t xml:space="preserve">The 0.41 reported here does not survive re-examination on its own records either.</w:t>
+      </w:r>
+      <w:r>
+        <w:t xml:space="preserve"> </w:t>
+      </w:r>
+      <w:r>
+        <w:t xml:space="preserve">Its two anchors were fitted on different subsets, 114 people for the measured</w:t>
+      </w:r>
+      <w:r>
+        <w:t xml:space="preserve"> </w:t>
+      </w:r>
+      <w:r>
+        <w:t xml:space="preserve">constant and 138 for the entered one, and both were regression fits rather than</w:t>
+      </w:r>
+      <w:r>
+        <w:t xml:space="preserve"> </w:t>
+      </w:r>
+      <w:r>
+        <w:t xml:space="preserve">medians. Matched person by person across the same 112 records and taken as medians,</w:t>
+      </w:r>
+      <w:r>
+        <w:t xml:space="preserve"> </w:t>
+      </w:r>
+      <w:r>
+        <w:t xml:space="preserve">the constants are 207 and 333, a ratio of 0.62, and the median of per-person ratios</w:t>
+      </w:r>
+      <w:r>
+        <w:t xml:space="preserve"> </w:t>
+      </w:r>
+      <w:r>
+        <w:t xml:space="preserve">is 0.60. As a Walsh-style constant that is 1432 measured against 2219 entered.</w:t>
       </w:r>
     </w:p>
     <w:p>

</xml_diff>